<commit_message>
Document that pdbWrite and trajWrite <= 0 write no file at all
docs/nerdss_optimized.md gains a 1.3 section on the change: what off now
means for each keyword, the changed default output (PDB/0.pdb), why restart
files keep their final write, the verification, and the measured cost of PDB
output on five suite models (pdbWrite = 100: 16-49% of the run; = 10:
65-90%). The 1.3 byte-identity rule now names PDB/0.pdb as its one exception.

The user guide's trajWrite and pdbWrite entries, the PDB/ subdirectory line
and the XYZ section say what 0 or below does; the PDF is re-exported from the
edited .docx by Word (same 21 pages; only the four passages and the table of
contents' dot leaders differ).

Co-Authored-By: Claude Opus 5.5 <noreply@anthropic.com>
</commit_message>
<xml_diff>
--- a/NERDSS_USER_GUIDE_MASTER.docx
+++ b/NERDSS_USER_GUIDE_MASTER.docx
@@ -5619,7 +5619,7 @@
           <w:color w:val="333333"/>
           <w:lang w:eastAsia="en-US"/>
         </w:rPr>
-        <w:t xml:space="preserve">.</w:t>
+        <w:t xml:space="preserve">. The directory is made only when pdbWrite is positive.</w:t>
       </w:r>
       <w:r>
         <w:rPr>
@@ -7066,7 +7066,7 @@
         <w:t xml:space="preserve">inp</w:t>
       </w:r>
       <w:r>
-        <w:t xml:space="preserve"> file.</w:t>
+        <w:t xml:space="preserve"> file; 0 or a negative value writes no trajectory.xyz at all.</w:t>
       </w:r>
       <w:r>
         <w:t xml:space="preserve">  NOTE: If the total copies of species can change per step, due to creation and destruction, for example, then these will not work in VMD. </w:t>
@@ -9443,7 +9443,7 @@
         <w:t xml:space="preserve">iteration </w:t>
       </w:r>
       <w:r>
-        <w:t xml:space="preserve">interval to write coordinates to trajectory file</w:t>
+        <w:t xml:space="preserve">interval to write coordinates to the trajectory file DATA/trajectory.xyz; a positive value also writes the first and the last step, and 0 or a negative value writes no trajectory file at all, not even the initial frame</w:t>
       </w:r>
       <w:r/>
     </w:p>
@@ -9701,7 +9701,7 @@
         <w:t xml:space="preserve"> file</w:t>
       </w:r>
       <w:r>
-        <w:t xml:space="preserve"> output</w:t>
+        <w:t xml:space="preserve"> output at all, not even of the initial frame (any value of 0 or below is off); a positive value also writes the first and the last step</w:t>
       </w:r>
       <w:r/>
     </w:p>

</xml_diff>

<commit_message>
Document the XYZ and CSV coordinate files in the branch notes and the user guide
docs/nerdss_optimized.md opens a Version 1.4 section with the first entry: the
three -c formats, the detection rules, the coordinate frame, the error
behaviour and the verification of #88.

The user guide's flag table now says -c takes PDB, XYZ or CSV; the "Use PDB
file to Initialize molecules" section becomes "Use a coordinate file (PDB,
XYZ or CSV) ..." and gains the placement rules, the centred frame, the
detection rules, an XYZ and a CSV rule list, the initial_crds.xyz warning
and the name/validation note. The PDF is re-exported from the edited .docx
by Word (22 pages, one more than before; the guide has no table of
contents).

Co-Authored-By: Claude Fable 5.1 <noreply@anthropic.com>
</commit_message>
<xml_diff>
--- a/NERDSS_USER_GUIDE_MASTER.docx
+++ b/NERDSS_USER_GUIDE_MASTER.docx
@@ -2857,7 +2857,7 @@
                 <w:rFonts w:eastAsia="Times New Roman" w:cs="Lucida Sans Unicode"/>
                 <w:color w:val="111111"/>
               </w:rPr>
-              <w:t xml:space="preserve">When start a new simulation, declare a coordinate file for initializing certain molecules at specified coordinates.</w:t>
+              <w:t xml:space="preserve">When starting a new simulation, declare a file of initial coordinates (PDB, XYZ or CSV; see “Use a coordinate file to initialize molecules at specific positions”) for placing all or some molecules at given positions (optional).</w:t>
             </w:r>
             <w:r>
               <w:rPr>
@@ -14108,7 +14108,7 @@
         <w:rPr>
           <w:rFonts w:ascii="Times New Roman" w:hAnsi="Times New Roman" w:cs="Times New Roman"/>
         </w:rPr>
-        <w:t xml:space="preserve">Use PDB file to Initialize molecules at specific positions.</w:t>
+        <w:t xml:space="preserve">Use a coordinate file (PDB, XYZ or CSV) to initialize molecules at specific positions.</w:t>
       </w:r>
       <w:r>
         <w:rPr>
@@ -14128,10 +14128,10 @@
         <w:t xml:space="preserve">Use the option `-c (--coordinate) &lt;coordinate file&gt;` to initialize all or part of molecules at specific positions. The coordinates of each molecule’s center of mass (COM) given in &lt;coordinate file&gt; will be the initial coordinates of </w:t>
       </w:r>
       <w:r>
-        <w:t xml:space="preserve">that molecule ‘s COM. The interfaces will be initialized at positions given by *.mol files. </w:t>
-      </w:r>
-      <w:r>
-        <w:t xml:space="preserve">The &lt;coordinate file&gt; should follow these rules:</w:t>
+        <w:t xml:space="preserve">that molecule ‘s COM. The interfaces will be initialized at positions given by *.mol files (only a translation is applied; orientations stay random). For each molecule name the first N molecules of that type, in the order of the molecules block, are moved onto the first N rows for that name; rows beyond the copy number are ignored, a name that is no molecule in the system is skipped, and molecules the file does not place keep their random positions (a random molecule that overlaps a placed one is moved afterwards). Coordinates are in nm, in the internal frame where the box runs from -L/2 to +L/2 on every axis (0 is the box center); DATA/initial_crds.xyz and the trajectory use that frame, while the PDB output is shifted by +L/2 and must be shifted back before it is given to -c. Three formats are read. The format is taken from the file extension (.pdb, .xyz or .csv, case does not matter); with any other or no extension it is taken from the content: a line starting with ATOM or HETATM means PDB, a first non-blank line that is a single whole number means XYZ, a first non-blank line holding a comma means CSV, and anything else stops the run. The log reports the choice (“coordinate file format: XYZ (from extension)”). </w:t>
+      </w:r>
+      <w:r>
+        <w:t xml:space="preserve">A PDB &lt;coordinate file&gt; should follow these rules:</w:t>
       </w:r>
       <w:r/>
     </w:p>
@@ -14374,6 +14374,158 @@
         <w:t xml:space="preserve">PDB files.</w:t>
       </w:r>
       <w:r/>
+    </w:p>
+    <w:p>
+      <w:pPr>
+        <w:pBdr/>
+        <w:spacing/>
+        <w:ind/>
+        <w:jc w:val="both"/>
+        <w:rPr/>
+      </w:pPr>
+      <w:r>
+        <w:rPr>
+          <w:b/>
+          <w:bCs/>
+        </w:rPr>
+        <w:t xml:space="preserve">XYZ. </w:t>
+      </w:r>
+      <w:r>
+        <w:t xml:space="preserve">An XYZ &lt;coordinate file&gt; should follow these rules:</w:t>
+      </w:r>
+    </w:p>
+    <w:p>
+      <w:pPr>
+        <w:pStyle w:val="823"/>
+        <w:numPr>
+          <w:ilvl w:val="0"/>
+          <w:numId w:val="24"/>
+        </w:numPr>
+        <w:pBdr/>
+        <w:spacing/>
+        <w:ind/>
+        <w:jc w:val="both"/>
+        <w:rPr/>
+      </w:pPr>
+      <w:r>
+        <w:t xml:space="preserve">Line 1 is the number of rows. Line 2 is a comment line and is always skipped, even when it is empty.</w:t>
+      </w:r>
+    </w:p>
+    <w:p>
+      <w:pPr>
+        <w:pStyle w:val="823"/>
+        <w:numPr>
+          <w:ilvl w:val="0"/>
+          <w:numId w:val="24"/>
+        </w:numPr>
+        <w:pBdr/>
+        <w:spacing/>
+        <w:ind/>
+        <w:jc w:val="both"/>
+        <w:rPr/>
+      </w:pPr>
+      <w:r>
+        <w:t xml:space="preserve">Every following line is one molecule: &lt;name&gt; &lt;X&gt; &lt;Y&gt; &lt;Z&gt;, separated by spaces or tabs, exactly four fields. Blank lines are skipped.</w:t>
+      </w:r>
+    </w:p>
+    <w:p>
+      <w:pPr>
+        <w:pStyle w:val="823"/>
+        <w:numPr>
+          <w:ilvl w:val="0"/>
+          <w:numId w:val="24"/>
+        </w:numPr>
+        <w:pBdr/>
+        <w:spacing/>
+        <w:ind/>
+        <w:jc w:val="both"/>
+        <w:rPr/>
+      </w:pPr>
+      <w:r>
+        <w:t xml:space="preserve">If the file holds fewer rows than line 1 announces, the run stops with an error; if it holds more, a warning is printed and the extra rows are ignored.</w:t>
+      </w:r>
+    </w:p>
+    <w:p>
+      <w:pPr>
+        <w:pStyle w:val="823"/>
+        <w:numPr>
+          <w:ilvl w:val="0"/>
+          <w:numId w:val="24"/>
+        </w:numPr>
+        <w:pBdr/>
+        <w:spacing/>
+        <w:ind/>
+        <w:jc w:val="both"/>
+        <w:rPr/>
+      </w:pPr>
+      <w:r>
+        <w:t xml:space="preserve">NERDSS’s own DATA/initial_crds.xyz looks like an XYZ file but lists each interface under the molecule name after the COM line, so fed back as-is every interface would be taken for another molecule. Keep only the COM lines (and correct line 1) before using it as an input.</w:t>
+      </w:r>
+    </w:p>
+    <w:p>
+      <w:pPr>
+        <w:pBdr/>
+        <w:spacing/>
+        <w:ind/>
+        <w:jc w:val="both"/>
+        <w:rPr/>
+      </w:pPr>
+      <w:r>
+        <w:rPr>
+          <w:b/>
+          <w:bCs/>
+        </w:rPr>
+        <w:t xml:space="preserve">CSV. </w:t>
+      </w:r>
+      <w:r>
+        <w:t xml:space="preserve">A CSV &lt;coordinate file&gt; should follow these rules:</w:t>
+      </w:r>
+    </w:p>
+    <w:p>
+      <w:pPr>
+        <w:pStyle w:val="823"/>
+        <w:numPr>
+          <w:ilvl w:val="0"/>
+          <w:numId w:val="24"/>
+        </w:numPr>
+        <w:pBdr/>
+        <w:spacing/>
+        <w:ind/>
+        <w:jc w:val="both"/>
+        <w:rPr/>
+      </w:pPr>
+      <w:r>
+        <w:t xml:space="preserve">One molecule per line: &lt;name&gt;,&lt;X&gt;,&lt;Y&gt;,&lt;Z&gt;, exactly four fields. Spaces around the fields, Windows (CRLF) line endings and blank lines are tolerated.</w:t>
+      </w:r>
+    </w:p>
+    <w:p>
+      <w:pPr>
+        <w:pStyle w:val="823"/>
+        <w:numPr>
+          <w:ilvl w:val="0"/>
+          <w:numId w:val="24"/>
+        </w:numPr>
+        <w:pBdr/>
+        <w:spacing/>
+        <w:ind/>
+        <w:jc w:val="both"/>
+        <w:rPr/>
+      </w:pPr>
+      <w:r>
+        <w:t xml:space="preserve">A header row is optional. The first non-blank row is taken as a header when its 2nd or 3rd field is not entirely a number (“x”, “1st” or “5.5x” are not numbers; “5.5” is), and is then skipped.</w:t>
+      </w:r>
+    </w:p>
+    <w:p>
+      <w:pPr>
+        <w:pBdr/>
+        <w:spacing/>
+        <w:ind/>
+        <w:jc w:val="both"/>
+        <w:rPr/>
+      </w:pPr>
+      <w:r>
+        <w:t xml:space="preserve">In XYZ and CSV files the name is matched exactly against the Name in the .mol file and has no length limit (PDB names are limited to 4 characters by the format). A malformed XYZ or CSV row — not four fields, or a coordinate that is not a number — stops the run with the file name and the line number. The PDB reader does not validate its input.</w:t>
+      </w:r>
     </w:p>
     <w:p>
       <w:pPr>

</xml_diff>